<commit_message>
docs: extend user agreement for registration
</commit_message>
<xml_diff>
--- a/public/documents/Пользовательское соглашение.docx
+++ b/public/documents/Пользовательское соглашение.docx
@@ -1471,6 +1471,206 @@
           <w:szCs w:val="24"/>
         </w:rPr>
         <w:t>Компания оставляет за собой право изменять условия Соглашения в одностороннем порядке. Изменения вступают в силу с момента их публикации на Сайте.</w:t>
+      </w:r>
+    </w:p>
+    <w:p>
+      <w:pPr>
+        <w:pStyle w:val="a5"/>
+        <w:numPr>
+          <w:ilvl w:val="0"/>
+          <w:numId w:val="3"/>
+        </w:numPr>
+        <w:tabs>
+          <w:tab w:val="left" w:pos="993"/>
+        </w:tabs>
+        <w:spacing w:after="0" w:line="360" w:lineRule="auto"/>
+        <w:ind w:left="0" w:firstLine="709"/>
+        <w:jc w:val="both"/>
+        <w:rPr>
+          <w:rFonts w:ascii="Times New Roman" w:hAnsi="Times New Roman" w:cs="Times New Roman"/>
+          <w:b/>
+          <w:bCs/>
+          <w:sz w:val="24"/>
+          <w:szCs w:val="24"/>
+        </w:rPr>
+      </w:pPr>
+      <w:r>
+        <w:rPr>
+          <w:rFonts w:ascii="Times New Roman" w:hAnsi="Times New Roman" w:cs="Times New Roman"/>
+          <w:b/>
+          <w:bCs/>
+          <w:sz w:val="24"/>
+          <w:szCs w:val="24"/>
+        </w:rPr>
+        <w:t xml:space="preserve">Регистрация и использование личного кабинета</w:t>
+      </w:r>
+    </w:p>
+    <w:p>
+      <w:pPr>
+        <w:pStyle w:val="a5"/>
+        <w:numPr>
+          <w:ilvl w:val="1"/>
+          <w:numId w:val="3"/>
+        </w:numPr>
+        <w:tabs>
+          <w:tab w:val="left" w:pos="1134"/>
+        </w:tabs>
+        <w:spacing w:after="0" w:line="360" w:lineRule="auto"/>
+        <w:ind w:left="0" w:firstLine="709"/>
+        <w:jc w:val="both"/>
+        <w:rPr>
+          <w:rFonts w:ascii="Times New Roman" w:hAnsi="Times New Roman" w:cs="Times New Roman"/>
+          <w:sz w:val="24"/>
+          <w:szCs w:val="24"/>
+        </w:rPr>
+      </w:pPr>
+      <w:r>
+        <w:rPr>
+          <w:rFonts w:ascii="Times New Roman" w:hAnsi="Times New Roman" w:cs="Times New Roman"/>
+          <w:sz w:val="24"/>
+          <w:szCs w:val="24"/>
+        </w:rPr>
+        <w:t xml:space="preserve">Регистрация учётной записи на Сайте является добровольной и предполагает предоставление Пользователем достоверных данных: имени, адреса электронной почты и пароля.</w:t>
+      </w:r>
+    </w:p>
+    <w:p>
+      <w:pPr>
+        <w:pStyle w:val="a5"/>
+        <w:numPr>
+          <w:ilvl w:val="1"/>
+          <w:numId w:val="3"/>
+        </w:numPr>
+        <w:tabs>
+          <w:tab w:val="left" w:pos="1134"/>
+        </w:tabs>
+        <w:spacing w:after="0" w:line="360" w:lineRule="auto"/>
+        <w:ind w:left="0" w:firstLine="709"/>
+        <w:jc w:val="both"/>
+        <w:rPr>
+          <w:rFonts w:ascii="Times New Roman" w:hAnsi="Times New Roman" w:cs="Times New Roman"/>
+          <w:sz w:val="24"/>
+          <w:szCs w:val="24"/>
+        </w:rPr>
+      </w:pPr>
+      <w:r>
+        <w:rPr>
+          <w:rFonts w:ascii="Times New Roman" w:hAnsi="Times New Roman" w:cs="Times New Roman"/>
+          <w:sz w:val="24"/>
+          <w:szCs w:val="24"/>
+        </w:rPr>
+        <w:t xml:space="preserve">Пользователь самостоятельно несёт ответственность за сохранность своих учётных данных (логина и пароля) и за все действия, совершённые с использованием его учётной записи.</w:t>
+      </w:r>
+    </w:p>
+    <w:p>
+      <w:pPr>
+        <w:pStyle w:val="a5"/>
+        <w:numPr>
+          <w:ilvl w:val="1"/>
+          <w:numId w:val="3"/>
+        </w:numPr>
+        <w:tabs>
+          <w:tab w:val="left" w:pos="1134"/>
+        </w:tabs>
+        <w:spacing w:after="0" w:line="360" w:lineRule="auto"/>
+        <w:ind w:left="0" w:firstLine="709"/>
+        <w:jc w:val="both"/>
+        <w:rPr>
+          <w:rFonts w:ascii="Times New Roman" w:hAnsi="Times New Roman" w:cs="Times New Roman"/>
+          <w:sz w:val="24"/>
+          <w:szCs w:val="24"/>
+        </w:rPr>
+      </w:pPr>
+      <w:r>
+        <w:rPr>
+          <w:rFonts w:ascii="Times New Roman" w:hAnsi="Times New Roman" w:cs="Times New Roman"/>
+          <w:sz w:val="24"/>
+          <w:szCs w:val="24"/>
+        </w:rPr>
+        <w:t xml:space="preserve">После регистрации Пользователю предоставляется доступ к личному кабинету, в рамках которого он может пользоваться функциями Сайта, связанными с учётной записью, и дополнять свои данные.</w:t>
+      </w:r>
+    </w:p>
+    <w:p>
+      <w:pPr>
+        <w:pStyle w:val="a5"/>
+        <w:numPr>
+          <w:ilvl w:val="1"/>
+          <w:numId w:val="3"/>
+        </w:numPr>
+        <w:tabs>
+          <w:tab w:val="left" w:pos="1134"/>
+        </w:tabs>
+        <w:spacing w:after="0" w:line="360" w:lineRule="auto"/>
+        <w:ind w:left="0" w:firstLine="709"/>
+        <w:jc w:val="both"/>
+        <w:rPr>
+          <w:rFonts w:ascii="Times New Roman" w:hAnsi="Times New Roman" w:cs="Times New Roman"/>
+          <w:sz w:val="24"/>
+          <w:szCs w:val="24"/>
+        </w:rPr>
+      </w:pPr>
+      <w:r>
+        <w:rPr>
+          <w:rFonts w:ascii="Times New Roman" w:hAnsi="Times New Roman" w:cs="Times New Roman"/>
+          <w:sz w:val="24"/>
+          <w:szCs w:val="24"/>
+        </w:rPr>
+        <w:t xml:space="preserve">В связи с использованием учётной записи Компания может направлять Пользователю служебные уведомления, необходимые для работы учётной записи, в том числе для подтверждения адреса электронной почты.</w:t>
+      </w:r>
+    </w:p>
+    <w:p>
+      <w:pPr>
+        <w:pStyle w:val="a5"/>
+        <w:numPr>
+          <w:ilvl w:val="1"/>
+          <w:numId w:val="3"/>
+        </w:numPr>
+        <w:tabs>
+          <w:tab w:val="left" w:pos="1134"/>
+        </w:tabs>
+        <w:spacing w:after="0" w:line="360" w:lineRule="auto"/>
+        <w:ind w:left="0" w:firstLine="709"/>
+        <w:jc w:val="both"/>
+        <w:rPr>
+          <w:rFonts w:ascii="Times New Roman" w:hAnsi="Times New Roman" w:cs="Times New Roman"/>
+          <w:sz w:val="24"/>
+          <w:szCs w:val="24"/>
+        </w:rPr>
+      </w:pPr>
+      <w:r>
+        <w:rPr>
+          <w:rFonts w:ascii="Times New Roman" w:hAnsi="Times New Roman" w:cs="Times New Roman"/>
+          <w:sz w:val="24"/>
+          <w:szCs w:val="24"/>
+        </w:rPr>
+        <w:t xml:space="preserve">Обработка персональных данных, указанных Пользователем при регистрации и при использовании личного кабинета, осуществляется на основании отдельного согласия на обработку персональных данных при регистрации, размещённого на Сайте.</w:t>
+      </w:r>
+    </w:p>
+    <w:p>
+      <w:pPr>
+        <w:pStyle w:val="a5"/>
+        <w:numPr>
+          <w:ilvl w:val="1"/>
+          <w:numId w:val="3"/>
+        </w:numPr>
+        <w:tabs>
+          <w:tab w:val="left" w:pos="1134"/>
+        </w:tabs>
+        <w:spacing w:after="0" w:line="360" w:lineRule="auto"/>
+        <w:ind w:left="0" w:firstLine="709"/>
+        <w:jc w:val="both"/>
+        <w:rPr>
+          <w:rFonts w:ascii="Times New Roman" w:hAnsi="Times New Roman" w:cs="Times New Roman"/>
+          <w:sz w:val="24"/>
+          <w:szCs w:val="24"/>
+        </w:rPr>
+      </w:pPr>
+      <w:r>
+        <w:rPr>
+          <w:rFonts w:ascii="Times New Roman" w:hAnsi="Times New Roman" w:cs="Times New Roman"/>
+          <w:sz w:val="24"/>
+          <w:szCs w:val="24"/>
+        </w:rPr>
+        <w:t xml:space="preserve">Пользователь вправе в любой момент прекратить использование учётной записи, удалив её в личном кабинете.</w:t>
       </w:r>
     </w:p>
     <w:p>

</xml_diff>